<commit_message>
Specs v3.1: add damage and fault reporting (incidents)
Requested by the pilot society's association. Residents report damage
or faults with photos; the report links to the active or recent
session, takes the charger out of service and alerts admins; admins
track status and share a PDF with the charging company.

Co-Authored-By: Claude Opus 5.5 <noreply@anthropic.com>
Claude-Session: https://claude.ai/code/session_011pCjtwAcALqYuUwPF39vNN
</commit_message>
<xml_diff>
--- a/docs/outreach/4_EVNest_Weekly_Demo_Checklist.docx
+++ b/docs/outreach/4_EVNest_Weekly_Demo_Checklist.docx
@@ -458,6 +458,19 @@
       </w:pPr>
       <w:r>
         <w:t xml:space="preserve">☐ Admin: end session, queue view, reports, usage log, settings. Account deletion works.</w:t>
+      </w:r>
+    </w:p>
+    <w:p>
+      <w:pPr>
+        <w:pStyle w:val="ListParagraph"/>
+        <w:numPr>
+          <w:ilvl w:val="0"/>
+          <w:numId w:val="3"/>
+        </w:numPr>
+        <w:spacing w:after="70"/>
+      </w:pPr>
+      <w:r>
+        <w:t xml:space="preserve">☐ Damage report: resident reports with photos → charger goes out of service → admin alerted immediately → linked session shown → status updated → PDF shared on WhatsApp.</w:t>
       </w:r>
     </w:p>
     <w:p>

</xml_diff>

<commit_message>
Specs v3.2: parking zones, tower-based flats, multiple admins
The likely pilot is a 4,000+ flat society (towers A-Z) with 5 shared
chargers spread across parking zones. Queue entries pick a zone or any
zone; registration uses a tower picker; 2-3 admins per society.

Co-Authored-By: Claude Opus 5.5 <noreply@anthropic.com>
Claude-Session: https://claude.ai/code/session_011pCjtwAcALqYuUwPF39vNN
</commit_message>
<xml_diff>
--- a/docs/outreach/4_EVNest_Weekly_Demo_Checklist.docx
+++ b/docs/outreach/4_EVNest_Weekly_Demo_Checklist.docx
@@ -296,6 +296,19 @@
         <w:spacing w:after="70"/>
       </w:pPr>
       <w:r>
+        <w:t xml:space="preserve">☐ Registration uses the tower picker (A–Z) + flat number; admin can create zones and assign chargers to zones.</w:t>
+      </w:r>
+    </w:p>
+    <w:p>
+      <w:pPr>
+        <w:pStyle w:val="ListParagraph"/>
+        <w:numPr>
+          <w:ilvl w:val="0"/>
+          <w:numId w:val="3"/>
+        </w:numPr>
+        <w:spacing w:after="70"/>
+      </w:pPr>
+      <w:r>
         <w:t xml:space="preserve">☐ Resident scans the QR, picks a duration, checks in; End session works; history shows used time.</w:t>
       </w:r>
     </w:p>
@@ -358,6 +371,19 @@
       </w:pPr>
       <w:r>
         <w:t xml:space="preserve">☐ Missed turn passes to the next flat; leave queue works; one place per flat enforced.</w:t>
+      </w:r>
+    </w:p>
+    <w:p>
+      <w:pPr>
+        <w:pStyle w:val="ListParagraph"/>
+        <w:numPr>
+          <w:ilvl w:val="0"/>
+          <w:numId w:val="3"/>
+        </w:numPr>
+        <w:spacing w:after="70"/>
+      </w:pPr>
+      <w:r>
+        <w:t xml:space="preserve">☐ Zone queue: a resident queued for Zone 1 is not offered a Zone 2 charger; an “any zone” resident is.</w:t>
       </w:r>
     </w:p>
     <w:p>

</xml_diff>